<commit_message>
la til landing page content
</commit_message>
<xml_diff>
--- a/docs/index.docx
+++ b/docs/index.docx
@@ -36,12 +36,97 @@
         </w:p>
       </w:sdtContent>
     </w:sdt>
+    <w:bookmarkStart w:id="23" w:name="welcome"/>
+    <w:p>
+      <w:pPr>
+        <w:pStyle w:val="Heading2"/>
+      </w:pPr>
+      <w:r>
+        <w:t xml:space="preserve">Welcome</w:t>
+      </w:r>
+    </w:p>
     <w:p>
       <w:pPr>
         <w:pStyle w:val="FirstParagraph"/>
       </w:pPr>
       <w:r>
-        <w:t xml:space="preserve">This is a Quarto website.</w:t>
+        <w:t xml:space="preserve">This website presents the assignments for OEKA201 completed by:</w:t>
+      </w:r>
+      <w:r>
+        <w:t xml:space="preserve"> </w:t>
+      </w:r>
+      <w:r>
+        <w:t xml:space="preserve">-</w:t>
+      </w:r>
+      <w:r>
+        <w:t xml:space="preserve"> </w:t>
+      </w:r>
+      <w:r>
+        <w:rPr>
+          <w:b/>
+          <w:bCs/>
+        </w:rPr>
+        <w:t xml:space="preserve">Bertelsen, Fredrik-André Hov</w:t>
+      </w:r>
+      <w:r>
+        <w:t xml:space="preserve"> </w:t>
+      </w:r>
+      <w:r>
+        <w:t xml:space="preserve">-</w:t>
+      </w:r>
+      <w:r>
+        <w:t xml:space="preserve"> </w:t>
+      </w:r>
+      <w:r>
+        <w:rPr>
+          <w:b/>
+          <w:bCs/>
+        </w:rPr>
+        <w:t xml:space="preserve">Yousefi, Arya</w:t>
+      </w:r>
+      <w:r>
+        <w:t xml:space="preserve"> </w:t>
+      </w:r>
+      <w:r>
+        <w:t xml:space="preserve">-</w:t>
+      </w:r>
+      <w:r>
+        <w:t xml:space="preserve"> </w:t>
+      </w:r>
+      <w:r>
+        <w:rPr>
+          <w:b/>
+          <w:bCs/>
+        </w:rPr>
+        <w:t xml:space="preserve">Røijem, Bendik Strømme</w:t>
+      </w:r>
+      <w:r>
+        <w:t xml:space="preserve"> </w:t>
+      </w:r>
+      <w:r>
+        <w:t xml:space="preserve">-</w:t>
+      </w:r>
+      <w:r>
+        <w:t xml:space="preserve"> </w:t>
+      </w:r>
+      <w:r>
+        <w:rPr>
+          <w:b/>
+          <w:bCs/>
+        </w:rPr>
+        <w:t xml:space="preserve">Lund, Kristian</w:t>
+      </w:r>
+      <w:r>
+        <w:t xml:space="preserve"> </w:t>
+      </w:r>
+      <w:r>
+        <w:t xml:space="preserve">## About this website</w:t>
+      </w:r>
+      <w:r>
+        <w:t xml:space="preserve"> </w:t>
+      </w:r>
+      <w:r>
+        <w:t xml:space="preserve">The site contains our econmetrics assignmetn analysing mortality rates across US states using socioeconomic &amp; health-related variables.</w:t>
       </w:r>
     </w:p>
     <w:p>
@@ -49,12 +134,74 @@
         <w:pStyle w:val="BodyText"/>
       </w:pPr>
       <w:r>
+        <w:t xml:space="preserve">The assinment is presented in two versions:</w:t>
+      </w:r>
+      <w:r>
+        <w:t xml:space="preserve"> </w:t>
+      </w:r>
+      <w:r>
+        <w:t xml:space="preserve">-</w:t>
+      </w:r>
+      <w:r>
+        <w:t xml:space="preserve"> </w:t>
+      </w:r>
+      <w:hyperlink r:id="rId20">
+        <w:r>
+          <w:rPr>
+            <w:rStyle w:val="Hyperlink"/>
+          </w:rPr>
+          <w:t xml:space="preserve">Bjørnar’s assignment using Gretl</w:t>
+        </w:r>
+      </w:hyperlink>
+      <w:r>
+        <w:t xml:space="preserve"> </w:t>
+      </w:r>
+      <w:r>
+        <w:t xml:space="preserve">- estimation and analysis performed in Gretl</w:t>
+      </w:r>
+      <w:r>
+        <w:t xml:space="preserve"> </w:t>
+      </w:r>
+      <w:r>
+        <w:t xml:space="preserve">-</w:t>
+      </w:r>
+      <w:r>
+        <w:t xml:space="preserve"> </w:t>
+      </w:r>
+      <w:hyperlink r:id="rId21">
+        <w:r>
+          <w:rPr>
+            <w:rStyle w:val="Hyperlink"/>
+          </w:rPr>
+          <w:t xml:space="preserve">Bjørnar’s assignment using R</w:t>
+        </w:r>
+      </w:hyperlink>
+      <w:r>
+        <w:t xml:space="preserve"> </w:t>
+      </w:r>
+      <w:r>
+        <w:t xml:space="preserve">- the same analysis replicatied using R code</w:t>
+      </w:r>
+    </w:p>
+    <w:p>
+      <w:pPr>
+        <w:pStyle w:val="BodyText"/>
+      </w:pPr>
+      <w:r>
+        <w:t xml:space="preserve">This is a Quarto website.</w:t>
+      </w:r>
+    </w:p>
+    <w:p>
+      <w:pPr>
+        <w:pStyle w:val="BodyText"/>
+      </w:pPr>
+      <w:r>
         <w:t xml:space="preserve">To learn more about Quarto websites visit</w:t>
       </w:r>
       <w:r>
         <w:t xml:space="preserve"> </w:t>
       </w:r>
-      <w:hyperlink r:id="rId20">
+      <w:hyperlink r:id="rId22">
         <w:r>
           <w:rPr>
             <w:rStyle w:val="Hyperlink"/>
@@ -66,6 +213,7 @@
         <w:t xml:space="preserve">.</w:t>
       </w:r>
     </w:p>
+    <w:bookmarkEnd w:id="23"/>
     <w:sectPr>
       <w:footnotePr>
         <w:numRestart w:val="eachSect"/>

</xml_diff>

<commit_message>
fikk lagt til en graf
</commit_message>
<xml_diff>
--- a/docs/index.docx
+++ b/docs/index.docx
@@ -23,19 +23,7 @@
             <w:pStyle w:val="TOCHeading"/>
           </w:pPr>
           <w:r>
-            <w:t xml:space="preserve">Table</w:t>
-          </w:r>
-          <w:r>
-            <w:t xml:space="preserve"> </w:t>
-          </w:r>
-          <w:r>
-            <w:t xml:space="preserve">of</w:t>
-          </w:r>
-          <w:r>
-            <w:t xml:space="preserve"> </w:t>
-          </w:r>
-          <w:r>
-            <w:t xml:space="preserve">contents</w:t>
+            <w:t xml:space="preserve">Table of contents</w:t>
           </w:r>
         </w:p>
         <w:p>
@@ -198,7 +186,11 @@
       </w:r>
     </w:p>
     <w:bookmarkEnd w:id="23"/>
-    <w:sectPr/>
+    <w:sectPr>
+      <w:footnotePr>
+        <w:numRestart w:val="eachSect"/>
+      </w:footnotePr>
+    </w:sectPr>
   </w:body>
 </w:document>
 </file>
@@ -476,8 +468,6 @@
     </w:pPr>
     <w:rPr>
       <w:rFonts w:asciiTheme="majorHAnsi" w:cstheme="majorBidi" w:eastAsiaTheme="majorEastAsia" w:hAnsiTheme="majorHAnsi"/>
-      <w:spacing w:val="-10"/>
-      <w:kern w:val="28"/>
       <w:sz w:val="56"/>
       <w:szCs w:val="56"/>
     </w:rPr>
@@ -490,15 +480,13 @@
     <w:rsid w:val="00A10FD9"/>
     <w:rPr>
       <w:rFonts w:asciiTheme="majorHAnsi" w:cstheme="majorBidi" w:eastAsiaTheme="majorEastAsia" w:hAnsiTheme="majorHAnsi"/>
-      <w:spacing w:val="-10"/>
-      <w:kern w:val="28"/>
       <w:sz w:val="56"/>
       <w:szCs w:val="56"/>
     </w:rPr>
   </w:style>
   <w:style w:styleId="Subtitle" w:type="paragraph">
     <w:name w:val="Subtitle"/>
-    <w:basedOn w:val="Normal"/>
+    <w:basedOn w:val="Title"/>
     <w:next w:val="BodyText"/>
     <w:link w:val="SubtitleChar"/>
     <w:uiPriority w:val="11"/>
@@ -509,6 +497,19 @@
         <w:ilvl w:val="1"/>
       </w:numPr>
     </w:pPr>
+    <w:rPr>
+      <w:rFonts w:cstheme="majorBidi" w:eastAsiaTheme="majorEastAsia"/>
+      <w:spacing w:val="15"/>
+      <w:sz w:val="28"/>
+      <w:szCs w:val="28"/>
+    </w:rPr>
+  </w:style>
+  <w:style w:customStyle="1" w:styleId="SubtitleChar" w:type="character">
+    <w:name w:val="Subtitle Char"/>
+    <w:basedOn w:val="DefaultParagraphFont"/>
+    <w:link w:val="Subtitle"/>
+    <w:uiPriority w:val="11"/>
+    <w:rsid w:val="00A10FD9"/>
     <w:rPr>
       <w:rFonts w:cstheme="majorBidi" w:eastAsiaTheme="majorEastAsia"/>
       <w:color w:themeColor="text1" w:themeTint="A6" w:val="595959"/>
@@ -517,39 +518,33 @@
       <w:szCs w:val="28"/>
     </w:rPr>
   </w:style>
-  <w:style w:customStyle="1" w:styleId="SubtitleChar" w:type="character">
-    <w:name w:val="Subtitle Char"/>
-    <w:basedOn w:val="DefaultParagraphFont"/>
-    <w:link w:val="Subtitle"/>
-    <w:uiPriority w:val="11"/>
-    <w:rsid w:val="00A10FD9"/>
-    <w:rPr>
-      <w:rFonts w:cstheme="majorBidi" w:eastAsiaTheme="majorEastAsia"/>
-      <w:color w:themeColor="text1" w:themeTint="A6" w:val="595959"/>
-      <w:spacing w:val="15"/>
-      <w:sz w:val="28"/>
-      <w:szCs w:val="28"/>
-    </w:rPr>
-  </w:style>
   <w:style w:customStyle="1" w:styleId="Author" w:type="paragraph">
     <w:name w:val="Author"/>
+    <w:basedOn w:val="Title"/>
     <w:next w:val="BodyText"/>
     <w:qFormat/>
     <w:pPr>
       <w:keepNext/>
       <w:keepLines/>
-      <w:jc w:val="center"/>
-    </w:pPr>
+    </w:pPr>
+    <w:rPr>
+      <w:sz w:val="24"/>
+      <w:szCs w:val="24"/>
+    </w:rPr>
   </w:style>
   <w:style w:styleId="Date" w:type="paragraph">
     <w:name w:val="Date"/>
+    <w:basedOn w:val="Title"/>
     <w:next w:val="BodyText"/>
     <w:qFormat/>
     <w:pPr>
       <w:keepNext/>
       <w:keepLines/>
-      <w:jc w:val="center"/>
-    </w:pPr>
+    </w:pPr>
+    <w:rPr>
+      <w:sz w:val="24"/>
+      <w:szCs w:val="24"/>
+    </w:rPr>
   </w:style>
   <w:style w:customStyle="1" w:styleId="AbstractTitle" w:type="paragraph">
     <w:name w:val="Abstract Title"/>
@@ -564,7 +559,6 @@
     </w:pPr>
     <w:rPr>
       <w:b/>
-      <w:color w:val="345A8A"/>
       <w:sz w:val="20"/>
       <w:szCs w:val="20"/>
     </w:rPr>

</xml_diff>

<commit_message>
Configure multi-format output for HTML, docx, PDF, ePub
</commit_message>
<xml_diff>
--- a/docs/index.docx
+++ b/docs/index.docx
@@ -23,7 +23,19 @@
             <w:pStyle w:val="TOCHeading"/>
           </w:pPr>
           <w:r>
-            <w:t xml:space="preserve">Table of contents</w:t>
+            <w:t xml:space="preserve">Table</w:t>
+          </w:r>
+          <w:r>
+            <w:t xml:space="preserve"> </w:t>
+          </w:r>
+          <w:r>
+            <w:t xml:space="preserve">of</w:t>
+          </w:r>
+          <w:r>
+            <w:t xml:space="preserve"> </w:t>
+          </w:r>
+          <w:r>
+            <w:t xml:space="preserve">contents</w:t>
           </w:r>
         </w:p>
         <w:p>
@@ -186,11 +198,7 @@
       </w:r>
     </w:p>
     <w:bookmarkEnd w:id="23"/>
-    <w:sectPr>
-      <w:footnotePr>
-        <w:numRestart w:val="eachSect"/>
-      </w:footnotePr>
-    </w:sectPr>
+    <w:sectPr/>
   </w:body>
 </w:document>
 </file>
@@ -468,6 +476,8 @@
     </w:pPr>
     <w:rPr>
       <w:rFonts w:asciiTheme="majorHAnsi" w:cstheme="majorBidi" w:eastAsiaTheme="majorEastAsia" w:hAnsiTheme="majorHAnsi"/>
+      <w:spacing w:val="-10"/>
+      <w:kern w:val="28"/>
       <w:sz w:val="56"/>
       <w:szCs w:val="56"/>
     </w:rPr>
@@ -480,13 +490,15 @@
     <w:rsid w:val="00A10FD9"/>
     <w:rPr>
       <w:rFonts w:asciiTheme="majorHAnsi" w:cstheme="majorBidi" w:eastAsiaTheme="majorEastAsia" w:hAnsiTheme="majorHAnsi"/>
+      <w:spacing w:val="-10"/>
+      <w:kern w:val="28"/>
       <w:sz w:val="56"/>
       <w:szCs w:val="56"/>
     </w:rPr>
   </w:style>
   <w:style w:styleId="Subtitle" w:type="paragraph">
     <w:name w:val="Subtitle"/>
-    <w:basedOn w:val="Title"/>
+    <w:basedOn w:val="Normal"/>
     <w:next w:val="BodyText"/>
     <w:link w:val="SubtitleChar"/>
     <w:uiPriority w:val="11"/>
@@ -499,6 +511,7 @@
     </w:pPr>
     <w:rPr>
       <w:rFonts w:cstheme="majorBidi" w:eastAsiaTheme="majorEastAsia"/>
+      <w:color w:themeColor="text1" w:themeTint="A6" w:val="595959"/>
       <w:spacing w:val="15"/>
       <w:sz w:val="28"/>
       <w:szCs w:val="28"/>
@@ -520,31 +533,23 @@
   </w:style>
   <w:style w:customStyle="1" w:styleId="Author" w:type="paragraph">
     <w:name w:val="Author"/>
-    <w:basedOn w:val="Title"/>
     <w:next w:val="BodyText"/>
     <w:qFormat/>
     <w:pPr>
       <w:keepNext/>
       <w:keepLines/>
-    </w:pPr>
-    <w:rPr>
-      <w:sz w:val="24"/>
-      <w:szCs w:val="24"/>
-    </w:rPr>
+      <w:jc w:val="center"/>
+    </w:pPr>
   </w:style>
   <w:style w:styleId="Date" w:type="paragraph">
     <w:name w:val="Date"/>
-    <w:basedOn w:val="Title"/>
     <w:next w:val="BodyText"/>
     <w:qFormat/>
     <w:pPr>
       <w:keepNext/>
       <w:keepLines/>
-    </w:pPr>
-    <w:rPr>
-      <w:sz w:val="24"/>
-      <w:szCs w:val="24"/>
-    </w:rPr>
+      <w:jc w:val="center"/>
+    </w:pPr>
   </w:style>
   <w:style w:customStyle="1" w:styleId="AbstractTitle" w:type="paragraph">
     <w:name w:val="Abstract Title"/>
@@ -559,6 +564,7 @@
     </w:pPr>
     <w:rPr>
       <w:b/>
+      <w:color w:val="345A8A"/>
       <w:sz w:val="20"/>
       <w:szCs w:val="20"/>
     </w:rPr>

</xml_diff>